<commit_message>
changes to the notebook
</commit_message>
<xml_diff>
--- a/Project Report.docx
+++ b/Project Report.docx
@@ -302,7 +302,7 @@
                   </wp:anchor>
                 </w:drawing>
               </mc:Choice>
-              <mc:Fallback>
+              <mc:Fallback xmlns="">
                 <w:pict>
                   <v:shapetype w14:anchorId="264490C2" id="_x0000_t202" coordsize="21600,21600" o:spt="202" path="m,l,21600r21600,l21600,xe">
                     <v:stroke joinstyle="miter"/>
@@ -629,7 +629,7 @@
                   </wp:anchor>
                 </w:drawing>
               </mc:Choice>
-              <mc:Fallback>
+              <mc:Fallback xmlns="">
                 <w:pict>
                   <v:rect w14:anchorId="4947C637" id="Rectangle 132" o:spid="_x0000_s1027" style="position:absolute;margin-left:-4.4pt;margin-top:0;width:46.8pt;height:77.75pt;z-index:251659264;visibility:visible;mso-wrap-style:square;mso-width-percent:76;mso-height-percent:98;mso-top-percent:23;mso-wrap-distance-left:9pt;mso-wrap-distance-top:0;mso-wrap-distance-right:9pt;mso-wrap-distance-bottom:0;mso-position-horizontal:right;mso-position-horizontal-relative:margin;mso-position-vertical-relative:page;mso-width-percent:76;mso-height-percent:98;mso-top-percent:23;mso-width-relative:page;mso-height-relative:page;v-text-anchor:bottom" o:gfxdata="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" fillcolor="#156082 [3204]" stroked="f" strokeweight="1.5pt">
                     <o:lock v:ext="edit" aspectratio="t"/>
@@ -696,6 +696,15 @@
     </w:sdt>
     <w:sdt>
       <w:sdtPr>
+        <w:rPr>
+          <w:rFonts w:asciiTheme="minorHAnsi" w:eastAsiaTheme="minorHAnsi" w:hAnsiTheme="minorHAnsi" w:cstheme="minorBidi"/>
+          <w:color w:val="auto"/>
+          <w:kern w:val="2"/>
+          <w:sz w:val="24"/>
+          <w:szCs w:val="24"/>
+          <w:lang w:val="en-GB"/>
+          <w14:ligatures w14:val="standardContextual"/>
+        </w:rPr>
         <w:id w:val="744456316"/>
         <w:docPartObj>
           <w:docPartGallery w:val="Table of Contents"/>
@@ -704,16 +713,9 @@
       </w:sdtPr>
       <w:sdtEndPr>
         <w:rPr>
-          <w:rFonts w:asciiTheme="minorHAnsi" w:eastAsiaTheme="minorHAnsi" w:hAnsiTheme="minorHAnsi" w:cstheme="minorBidi"/>
           <w:b/>
           <w:bCs/>
           <w:noProof/>
-          <w:color w:val="auto"/>
-          <w:kern w:val="2"/>
-          <w:sz w:val="24"/>
-          <w:szCs w:val="24"/>
-          <w:lang w:val="en-GB"/>
-          <w14:ligatures w14:val="standardContextual"/>
         </w:rPr>
       </w:sdtEndPr>
       <w:sdtContent>
@@ -1517,6 +1519,17 @@
         <w:t>Dataset Description</w:t>
       </w:r>
       <w:bookmarkEnd w:id="1"/>
+    </w:p>
+    <w:p>
+      <w:r>
+        <w:t>-908Nr5g9F0bSO6WHEFWgbek3mC28vEiR9D3Hvf3218kgagV0TsC-hyspC7CSDT3PxWDZ2Ohkbj_w5ygHcrMRVQrp_o3An4</w:t>
+      </w:r>
+      <w:r>
+        <w:t>-</w:t>
+      </w:r>
+      <w:r>
+        <w:t>GiswUimvYbTg01R0kq06tRmICJ3TR5gMx1Lq6DlxtgwmgMnoVLoEcF7I4Vta-VUhmww9d5uAvXo7_Q8XEemRD8dOt7eq-aRgdPDGNVurfemm18HI-1:brhiguezmanagement@outlook.com</w:t>
+      </w:r>
     </w:p>
     <w:p>
       <w:pPr>
@@ -1620,10 +1633,7 @@
       </w:pPr>
       <w:bookmarkStart w:id="6" w:name="_Toc212736600"/>
       <w:r>
-        <w:t>Comparison</w:t>
-      </w:r>
-      <w:r>
-        <w:t xml:space="preserve"> of Models’ Results</w:t>
+        <w:t>Comparison of Models’ Results</w:t>
       </w:r>
       <w:bookmarkEnd w:id="6"/>
     </w:p>

</xml_diff>

<commit_message>
updates before progress review
</commit_message>
<xml_diff>
--- a/Project Report.docx
+++ b/Project Report.docx
@@ -1563,7 +1563,6 @@
       <w:r>
         <w:t xml:space="preserve">Given real-time IoT network flow data, containing both flow from regular devices, as well as specific attack scenarios with features like packet rates, flow duration, TCP flags and protocols; The proposal is to build a supervised machine learning model that, with the categorical feature </w:t>
       </w:r>
-      <w:proofErr w:type="spellStart"/>
       <w:r>
         <w:rPr>
           <w:i/>
@@ -1571,7 +1570,6 @@
         </w:rPr>
         <w:t>attack_type</w:t>
       </w:r>
-      <w:proofErr w:type="spellEnd"/>
       <w:r>
         <w:t xml:space="preserve"> as the target, can classify whether a network flow belongs to a specific cybersecurity attack type or if is malicious at all, given a set of network flow features. Additionally the model will give insight into which features contribute most to its performance.</w:t>
       </w:r>
@@ -1591,6 +1589,21 @@
         <w:t>Guided by the notebooks created in previous labs, several supervised learning algorithms will be used to make predictions, and subsequently compared to see which is more effective. Among the attempted models will be Logistic Regression, KNN, Decision Tree and SVM; as well as any other algorithms discovered through further research.</w:t>
       </w:r>
     </w:p>
+    <w:p/>
+    <w:p>
+      <w:r>
+        <w:t>Visualizwe the data with different fort the pca and see how it influeces the model, do a visualization on the misclassified points for example 3 vs 0 and show why the error is so big on this one</w:t>
+      </w:r>
+    </w:p>
+    <w:p>
+      <w:r>
+        <w:t>Try to evaluate impact of features, do a gridsear</w:t>
+      </w:r>
+      <w:bookmarkStart w:id="4" w:name="_Toc212736598"/>
+      <w:r>
+        <w:t>ch to optimize model</w:t>
+      </w:r>
+    </w:p>
     <w:p>
       <w:pPr>
         <w:pStyle w:val="Heading1"/>
@@ -1599,7 +1612,6 @@
           <w:numId w:val="1"/>
         </w:numPr>
       </w:pPr>
-      <w:bookmarkStart w:id="4" w:name="_Toc212736598"/>
       <w:r>
         <w:lastRenderedPageBreak/>
         <w:t>M</w:t>
@@ -2206,7 +2218,6 @@
     <w:next w:val="Normal"/>
     <w:link w:val="Heading2Char"/>
     <w:uiPriority w:val="9"/>
-    <w:semiHidden/>
     <w:unhideWhenUsed/>
     <w:qFormat/>
     <w:rsid w:val="00FB7E2C"/>
@@ -2424,7 +2435,6 @@
     <w:basedOn w:val="DefaultParagraphFont"/>
     <w:link w:val="Heading2"/>
     <w:uiPriority w:val="9"/>
-    <w:semiHidden/>
     <w:rsid w:val="00FB7E2C"/>
     <w:rPr>
       <w:rFonts w:asciiTheme="majorHAnsi" w:eastAsiaTheme="majorEastAsia" w:hAnsiTheme="majorHAnsi" w:cstheme="majorBidi"/>

</xml_diff>